<commit_message>
docs: total time 10 h, final AI-disclosure wording, fallback and legacy-code notes
Co-Authored-By: Claude Sonnet 5.5 <noreply@anthropic.com>
</commit_message>
<xml_diff>
--- a/submission/Submission_Problem1_and_2.docx
+++ b/submission/Submission_Problem1_and_2.docx
@@ -471,7 +471,7 @@
                 <w:sz w:val="18"/>
                 <w:szCs w:val="20"/>
               </w:rPr>
-              <w:t>[ candidate: enter the combined total for Problems 1 + 2 — Problem 1 alone was ~8 hours ]</w:t>
+              <w:t>~10 hours (Problems 1 and 2 together)</w:t>
             </w:r>
           </w:p>
         </w:tc>
@@ -8917,7 +8917,7 @@
                 <w:sz w:val="20"/>
                 <w:szCs w:val="20"/>
               </w:rPr>
-              <w:t>Tool: Claude Code (Anthropic, model Claude Sonnet 5.5) in VS Code. Claude Code reviewed the existing Problem 2 repository and found that its 'judge' was a keyword-driven mock whose README numbers (e.g. 35% -&gt; 0% flip rate, kappa 0.737, 100% adversarial robustness) did not come from any measurement; it then built the new judge/ package (rubric, prompts, robust parser, both-order pairwise, audit log with replay, statistics, A/B decision rule, experiments, CLI) and the unit tests, wrote the 26 gold cases, 22 position pairs and probe sets and their labels before running any judge, ran the experiments against Groq, diagnosed the rate-limit and token-cap problems (qwen output-token limit, gpt-oss-120b daily quota, truncated generations), rewired the web API to the real judge, replaced hard-coded UI numbers with measured results, wrote the README and handover addendum, and filled this document from judge/results/*.json. Choices made by Claude, not by an independent human: the gold labels, the rubric weights and pass rule, and the switch to gpt-oss-20b for part of the experiments. The reflection box in 2.5 ('explain your position-bias check') is left for the candidate. [Candidate: review and edit this paragraph so it states exactly what you did yourself.]</w:t>
+              <w:t>Tool: Claude Code (Anthropic, model Claude Sonnet 5.5) in VS Code. Claude Code reviewed the existing Problem 2 repository and found that its 'judge' was a keyword-driven mock whose README numbers (e.g. 35% -&gt; 0% flip rate, kappa 0.737, 100% adversarial robustness) did not come from any measurement; it then built the new judge/ package (rubric, prompts, robust parser, both-order pairwise, audit log with replay, statistics, A/B decision rule, experiments, CLI) and the unit tests, wrote the 26 gold cases, 22 position pairs and probe sets and their labels before running any judge, ran the experiments against Groq, diagnosed the rate-limit and token-cap problems (qwen output-token limit, gpt-oss-120b daily quota, truncated generations), rewired the web API to the real judge, replaced hard-coded UI numbers with measured results, wrote the README and handover addendum, and filled this document from judge/results/*.json. Claude Code also made these choices, which no independent human checked: the gold labels, the rubric weights and pass rule, and the switch to gpt-oss-20b for part of the experiments. Claude Code later added a live-model fallback chain (gpt-oss-120b, then gpt-oss-20b) to the code. The 2.5 reflection 'explain your position-bias check' is not generated by Claude Code; it is left for the candidate to write in their own words.</w:t>
             </w:r>
           </w:p>
         </w:tc>

</xml_diff>

<commit_message>
fix(ui): drop hard-coded cost/latency defaults and stale tab badges; add live-deployment screenshots to the submission
Co-Authored-By: Claude Sonnet 5.5 <noreply@anthropic.com>
</commit_message>
<xml_diff>
--- a/submission/Submission_Problem1_and_2.docx
+++ b/submission/Submission_Problem1_and_2.docx
@@ -8459,6 +8459,88 @@
               <w:br/>
               <w:br/>
               <w:t>(Text excerpt; replace with a screenshot of the log line if you prefer.)</w:t>
+            </w:r>
+          </w:p>
+          <w:p>
+            <w:r>
+              <w:t>Live deployment (https://synergylabs-assignment2.vercel.app/), pointwise verdict: judge openai/gpt-oss-120b, executed live on Groq, latency and tokens shown.</w:t>
+            </w:r>
+          </w:p>
+          <w:p>
+            <w:r>
+              <w:drawing>
+                <wp:inline xmlns:a="http://schemas.openxmlformats.org/drawingml/2006/main" xmlns:pic="http://schemas.openxmlformats.org/drawingml/2006/picture">
+                  <wp:extent cx="5486400" cy="3429000"/>
+                  <wp:docPr id="2" name="Picture 2"/>
+                  <wp:cNvGraphicFramePr>
+                    <a:graphicFrameLocks noChangeAspect="1"/>
+                  </wp:cNvGraphicFramePr>
+                  <a:graphic>
+                    <a:graphicData uri="http://schemas.openxmlformats.org/drawingml/2006/picture">
+                      <pic:pic>
+                        <pic:nvPicPr>
+                          <pic:cNvPr id="0" name="p2_live_verdict.png"/>
+                          <pic:cNvPicPr/>
+                        </pic:nvPicPr>
+                        <pic:blipFill>
+                          <a:blip r:embed="rId10"/>
+                          <a:stretch>
+                            <a:fillRect/>
+                          </a:stretch>
+                        </pic:blipFill>
+                        <pic:spPr>
+                          <a:xfrm>
+                            <a:off x="0" y="0"/>
+                            <a:ext cx="5486400" cy="3429000"/>
+                          </a:xfrm>
+                          <a:prstGeom prst="rect"/>
+                        </pic:spPr>
+                      </pic:pic>
+                    </a:graphicData>
+                  </a:graphic>
+                </wp:inline>
+              </w:drawing>
+            </w:r>
+          </w:p>
+          <w:p>
+            <w:r>
+              <w:t>Same verdict: per-criterion score, rationale and verbatim evidence quote from the model output.</w:t>
+            </w:r>
+          </w:p>
+          <w:p>
+            <w:r>
+              <w:drawing>
+                <wp:inline xmlns:a="http://schemas.openxmlformats.org/drawingml/2006/main" xmlns:pic="http://schemas.openxmlformats.org/drawingml/2006/picture">
+                  <wp:extent cx="5486400" cy="3429000"/>
+                  <wp:docPr id="3" name="Picture 3"/>
+                  <wp:cNvGraphicFramePr>
+                    <a:graphicFrameLocks noChangeAspect="1"/>
+                  </wp:cNvGraphicFramePr>
+                  <a:graphic>
+                    <a:graphicData uri="http://schemas.openxmlformats.org/drawingml/2006/picture">
+                      <pic:pic>
+                        <pic:nvPicPr>
+                          <pic:cNvPr id="0" name="p2_live_verdict_criteria.png"/>
+                          <pic:cNvPicPr/>
+                        </pic:nvPicPr>
+                        <pic:blipFill>
+                          <a:blip r:embed="rId11"/>
+                          <a:stretch>
+                            <a:fillRect/>
+                          </a:stretch>
+                        </pic:blipFill>
+                        <pic:spPr>
+                          <a:xfrm>
+                            <a:off x="0" y="0"/>
+                            <a:ext cx="5486400" cy="3429000"/>
+                          </a:xfrm>
+                          <a:prstGeom prst="rect"/>
+                        </pic:spPr>
+                      </pic:pic>
+                    </a:graphicData>
+                  </a:graphic>
+                </wp:inline>
+              </w:drawing>
             </w:r>
           </w:p>
         </w:tc>

</xml_diff>

<commit_message>
docs(submission): add candidate's own 2.5 position-bias reflection
Co-Authored-By: Claude Sonnet 5.5 <noreply@anthropic.com>
</commit_message>
<xml_diff>
--- a/submission/Submission_Problem1_and_2.docx
+++ b/submission/Submission_Problem1_and_2.docx
@@ -8761,18 +8761,7 @@
                 <w:sz w:val="20"/>
                 <w:szCs w:val="20"/>
               </w:rPr>
-              <w:t>[ CANDIDATE: write this in your own words and save it as submission/reflection_p2_posbias.txt, then re-run submission/fill_submission.py. The assignment requires this box to be written without AI help. ]</w:t>
-              <w:br/>
-              <w:br/>
-              <w:t>Facts you can draw on (not an answer):</w:t>
-              <w:br/>
-              <w:t>- Each pair is sent twice, once as (A,B) and once as (B,A); the second verdict is mapped back to the original labels (judge/core.py judge_pair / combine_orders).</w:t>
-              <w:br/>
-              <w:t>- If both orders agree the verdict stands; if not, it is a TIE and flagged. A hard flip means A in one order and B in the other.</w:t>
-              <w:br/>
-              <w:t>- Measured here: baseline prompt, 22 pairs: 2 disagreements (1 hard flip); real A/B suite: 6 of 14 disagreements.</w:t>
-              <w:br/>
-              <w:t>- Think about: what a high flip rate says about the judge (it responds to position, not content), what it means for single-order results, what the fix costs (more TIEs, 2x calls), and what the check cannot detect (a judge that is consistently wrong in both orders).</w:t>
+              <w:t>I tested the judge by evaluating each pair twice, swapping the order of A and B, and mapping the second verdict back to the original labels. If both orders agreed, I kept the verdict; if they disagreed, I marked it as a TIE and flagged it. In the baseline test, 2 out of 22 pairs disagreed, including 1 hard flip where the winner completely reversed. In the real A/B test suite, 6 out of 14 pairs disagreed. This showed me that the judge can be sensitive to the position of an answer rather than just its content, meaning single-order results may be unreliable. The trade-off is that checking both orders doubles the number of judge calls and can produce more TIEs, but it makes the evaluation more robust to position bias. One limitation is that this check cannot catch a judge that consistently gives the wrong verdict in both orders.</w:t>
             </w:r>
           </w:p>
         </w:tc>

</xml_diff>